<commit_message>
SOW v3: Client sponsors paid resources, no figure; close E26
Section 6 now says that where the project needs paid resources (GPU or other
hardware, sandbox compute, model API usage) the Client sponsors or covers
them, and the team agrees such usage in advance. No dollar cap, as decided.
</commit_message>
<xml_diff>
--- a/docs/sow/Scope of Work v3.docx
+++ b/docs/sow/Scope of Work v3.docx
@@ -1553,6 +1553,18 @@
           <w:rtl w:val="0"/>
         </w:rPr>
         <w:t xml:space="preserve"> for the local model.</w:t>
+      </w:r>
+    </w:p>
+    <w:p>
+      <w:pPr>
+        <w:spacing w:after="240" w:before="240" w:lineRule="auto"/>
+        <w:rPr/>
+      </w:pPr>
+      <w:r>
+        <w:rPr>
+          <w:rtl w:val="0"/>
+        </w:rPr>
+        <w:t xml:space="preserve">Where the project requires paid resources, such as GPU or other hardware resources, sandbox compute, or model API usage, the Client will sponsor or cover these costs. The student project team will agree any such usage with the Client in advance.</w:t>
       </w:r>
     </w:p>
     <w:p>

</xml_diff>

<commit_message>
SOW v3: timeline follows the deck's schedule slide; add Word-exported PDF
Section 5 now mirrors slide 39 row by row: contract and skeleton (Oct 5-11),
fall break, service build (Oct 19 - Nov 1), Phase 1 standalone testing
(Oct 26 - Nov 8), Phase 2 VG08 integration with hardening (Nov 2-15),
documentation and final evaluation (Nov 16-22), rehearsal (Nov 23-29), and
the six milestones listed as on the slide. The PDF was exported from Word
and checked page by page (7 pages).
</commit_message>
<xml_diff>
--- a/docs/sow/Scope of Work v3.docx
+++ b/docs/sow/Scope of Work v3.docx
@@ -1212,6 +1212,18 @@
         <w:rPr>
           <w:rtl w:val="0"/>
         </w:rPr>
+        <w:t xml:space="preserve">The schedule below follows the service engineering schedule presented at the Midterm Presentation (October 5 to November 30, 2026).</w:t>
+      </w:r>
+    </w:p>
+    <w:p>
+      <w:pPr>
+        <w:spacing w:after="240" w:before="240" w:lineRule="auto"/>
+        <w:rPr/>
+      </w:pPr>
+      <w:r>
+        <w:rPr>
+          <w:rtl w:val="0"/>
+        </w:rPr>
         <w:t xml:space="preserve">• </w:t>
       </w:r>
       <w:r>
@@ -1325,7 +1337,7 @@
           <w:iCs w:val="1"/>
           <w:rtl w:val="0"/>
         </w:rPr>
-        <w:t xml:space="preserve">Week 7</w:t>
+        <w:t xml:space="preserve">Week 7, October 5–11</w:t>
       </w:r>
       <w:r>
         <w:br w:type="textWrapping"/>
@@ -1334,7 +1346,7 @@
         <w:rPr>
           <w:rtl w:val="0"/>
         </w:rPr>
-        <w:t xml:space="preserve">API contract version 0.4.2 and the service skeleton, by October 11, 2026. Week 8 (from October 12) is fall break.</w:t>
+        <w:t xml:space="preserve">API contract version 0.4.2 and the service skeleton. Dashboard and load-testing work begins.</w:t>
       </w:r>
     </w:p>
     <w:p>
@@ -1354,7 +1366,7 @@
           <w:bCs w:val="1"/>
           <w:rtl w:val="0"/>
         </w:rPr>
-        <w:t xml:space="preserve">Phase 1: Build and Standalone Testing</w:t>
+        <w:t xml:space="preserve">Fall Break</w:t>
       </w:r>
       <w:r>
         <w:rPr>
@@ -1368,7 +1380,7 @@
           <w:iCs w:val="1"/>
           <w:rtl w:val="0"/>
         </w:rPr>
-        <w:t xml:space="preserve">Weeks 9–10</w:t>
+        <w:t xml:space="preserve">Week 8, October 12–18</w:t>
       </w:r>
       <w:r>
         <w:br w:type="textWrapping"/>
@@ -1377,7 +1389,7 @@
         <w:rPr>
           <w:rtl w:val="0"/>
         </w:rPr>
-        <w:t xml:space="preserve">Build the HTTP API, request records, model adapter, pipeline wiring, and failure path, with the end-to-end pipeline working by November 1, 2026. Test the service on its own from late October.</w:t>
+        <w:t xml:space="preserve">No project work.</w:t>
       </w:r>
     </w:p>
     <w:p>
@@ -1397,7 +1409,7 @@
           <w:bCs w:val="1"/>
           <w:rtl w:val="0"/>
         </w:rPr>
-        <w:t xml:space="preserve">Phase 2: VG08 Integration and Hardening</w:t>
+        <w:t xml:space="preserve">Service Build</w:t>
       </w:r>
       <w:r>
         <w:rPr>
@@ -1411,7 +1423,7 @@
           <w:iCs w:val="1"/>
           <w:rtl w:val="0"/>
         </w:rPr>
-        <w:t xml:space="preserve">Weeks 11–13</w:t>
+        <w:t xml:space="preserve">Weeks 9–10, October 19 – November 1</w:t>
       </w:r>
       <w:r>
         <w:br w:type="textWrapping"/>
@@ -1420,7 +1432,7 @@
         <w:rPr>
           <w:rtl w:val="0"/>
         </w:rPr>
-        <w:t xml:space="preserve">Integrate with VG08 from November 2, 2026. Dashboard and load-test results by November 8; VG08 integration and API contract freeze by November 15; code freeze on November 22 (soft freeze November 18). Documentation and final evaluation.</w:t>
+        <w:t xml:space="preserve">Gateway, request records, and model adapter (week of October 19); pipeline wiring and failure path (October 19 – November 1).</w:t>
       </w:r>
     </w:p>
     <w:p>
@@ -1440,7 +1452,7 @@
           <w:bCs w:val="1"/>
           <w:rtl w:val="0"/>
         </w:rPr>
-        <w:t xml:space="preserve">Final Preparation</w:t>
+        <w:t xml:space="preserve">Phase 1: Standalone Testing</w:t>
       </w:r>
       <w:r>
         <w:rPr>
@@ -1454,7 +1466,7 @@
           <w:iCs w:val="1"/>
           <w:rtl w:val="0"/>
         </w:rPr>
-        <w:t xml:space="preserve">Week 14</w:t>
+        <w:t xml:space="preserve">Weeks 10–11, October 26 – November 8</w:t>
       </w:r>
       <w:r>
         <w:br w:type="textWrapping"/>
@@ -1463,19 +1475,19 @@
         <w:rPr>
           <w:rtl w:val="0"/>
         </w:rPr>
-        <w:t xml:space="preserve">Presentation materials and rehearsal.</w:t>
-      </w:r>
-    </w:p>
-    <w:p>
-      <w:pPr>
-        <w:spacing w:after="240" w:before="240" w:lineRule="auto"/>
-        <w:rPr/>
-      </w:pPr>
-      <w:r>
-        <w:rPr>
-          <w:rtl w:val="0"/>
-        </w:rPr>
-        <w:t xml:space="preserve">The </w:t>
+        <w:t xml:space="preserve">The redaction service is tested on its own. Dashboard and load testing in the week of November 2.</w:t>
+      </w:r>
+    </w:p>
+    <w:p>
+      <w:pPr>
+        <w:spacing w:after="240" w:before="240" w:lineRule="auto"/>
+        <w:rPr/>
+      </w:pPr>
+      <w:r>
+        <w:rPr>
+          <w:rtl w:val="0"/>
+        </w:rPr>
+        <w:t xml:space="preserve">• </w:t>
       </w:r>
       <w:r>
         <w:rPr>
@@ -1483,13 +1495,42 @@
           <w:bCs w:val="1"/>
           <w:rtl w:val="0"/>
         </w:rPr>
-        <w:t xml:space="preserve">Final Presentation</w:t>
-      </w:r>
-      <w:r>
-        <w:rPr>
-          <w:rtl w:val="0"/>
-        </w:rPr>
-        <w:t xml:space="preserve"> to the Client is scheduled for </w:t>
+        <w:t xml:space="preserve">Phase 2: VG08 Integration</w:t>
+      </w:r>
+      <w:r>
+        <w:rPr>
+          <w:rtl w:val="0"/>
+        </w:rPr>
+        <w:t xml:space="preserve"> – </w:t>
+      </w:r>
+      <w:r>
+        <w:rPr>
+          <w:i w:val="1"/>
+          <w:iCs w:val="1"/>
+          <w:rtl w:val="0"/>
+        </w:rPr>
+        <w:t xml:space="preserve">Weeks 11–12, November 2–15</w:t>
+      </w:r>
+      <w:r>
+        <w:br w:type="textWrapping"/>
+      </w:r>
+      <w:r>
+        <w:rPr>
+          <w:rtl w:val="0"/>
+        </w:rPr>
+        <w:t xml:space="preserve">Integration with the Client’s VG08 service, with hardening and the contract freeze in the week of November 9.</w:t>
+      </w:r>
+    </w:p>
+    <w:p>
+      <w:pPr>
+        <w:spacing w:after="240" w:before="240" w:lineRule="auto"/>
+        <w:rPr/>
+      </w:pPr>
+      <w:r>
+        <w:rPr>
+          <w:rtl w:val="0"/>
+        </w:rPr>
+        <w:t xml:space="preserve">• </w:t>
       </w:r>
       <w:r>
         <w:rPr>
@@ -1497,13 +1538,13 @@
           <w:bCs w:val="1"/>
           <w:rtl w:val="0"/>
         </w:rPr>
-        <w:t xml:space="preserve">November 30, 2026</w:t>
-      </w:r>
-      <w:r>
-        <w:rPr>
-          <w:rtl w:val="0"/>
-        </w:rPr>
-        <w:t xml:space="preserve">. – </w:t>
+        <w:t xml:space="preserve">Documentation and Final Evaluation</w:t>
+      </w:r>
+      <w:r>
+        <w:rPr>
+          <w:rtl w:val="0"/>
+        </w:rPr>
+        <w:t xml:space="preserve"> – </w:t>
       </w:r>
       <w:r>
         <w:rPr>
@@ -1511,7 +1552,217 @@
           <w:iCs w:val="1"/>
           <w:rtl w:val="0"/>
         </w:rPr>
+        <w:t xml:space="preserve">Week 13, November 16–22</w:t>
+      </w:r>
+      <w:r>
+        <w:br w:type="textWrapping"/>
+      </w:r>
+      <w:r>
+        <w:rPr>
+          <w:rtl w:val="0"/>
+        </w:rPr>
+        <w:t xml:space="preserve">Documentation and the final evaluation on the benchmark.</w:t>
+      </w:r>
+    </w:p>
+    <w:p>
+      <w:pPr>
+        <w:spacing w:after="240" w:before="240" w:lineRule="auto"/>
+        <w:rPr/>
+      </w:pPr>
+      <w:r>
+        <w:rPr>
+          <w:rtl w:val="0"/>
+        </w:rPr>
+        <w:t xml:space="preserve">• </w:t>
+      </w:r>
+      <w:r>
+        <w:rPr>
+          <w:b w:val="1"/>
+          <w:bCs w:val="1"/>
+          <w:rtl w:val="0"/>
+        </w:rPr>
+        <w:t xml:space="preserve">Team Materials and Rehearsal</w:t>
+      </w:r>
+      <w:r>
+        <w:rPr>
+          <w:rtl w:val="0"/>
+        </w:rPr>
+        <w:t xml:space="preserve"> – </w:t>
+      </w:r>
+      <w:r>
+        <w:rPr>
+          <w:i w:val="1"/>
+          <w:iCs w:val="1"/>
+          <w:rtl w:val="0"/>
+        </w:rPr>
+        <w:t xml:space="preserve">Week 14, November 23–29</w:t>
+      </w:r>
+      <w:r>
+        <w:br w:type="textWrapping"/>
+      </w:r>
+      <w:r>
+        <w:rPr>
+          <w:rtl w:val="0"/>
+        </w:rPr>
+        <w:t xml:space="preserve">Final presentation materials and rehearsal.</w:t>
+      </w:r>
+    </w:p>
+    <w:p>
+      <w:pPr>
+        <w:spacing w:after="240" w:before="240" w:lineRule="auto"/>
+        <w:rPr/>
+      </w:pPr>
+      <w:r>
+        <w:rPr>
+          <w:rtl w:val="0"/>
+        </w:rPr>
+        <w:t xml:space="preserve">The </w:t>
+      </w:r>
+      <w:r>
+        <w:rPr>
+          <w:b w:val="1"/>
+          <w:bCs w:val="1"/>
+          <w:rtl w:val="0"/>
+        </w:rPr>
+        <w:t xml:space="preserve">Final Presentation</w:t>
+      </w:r>
+      <w:r>
+        <w:rPr>
+          <w:rtl w:val="0"/>
+        </w:rPr>
+        <w:t xml:space="preserve"> to the Client is scheduled for </w:t>
+      </w:r>
+      <w:r>
+        <w:rPr>
+          <w:b w:val="1"/>
+          <w:bCs w:val="1"/>
+          <w:rtl w:val="0"/>
+        </w:rPr>
+        <w:t xml:space="preserve">November 30, 2026</w:t>
+      </w:r>
+      <w:r>
+        <w:rPr>
+          <w:rtl w:val="0"/>
+        </w:rPr>
+        <w:t xml:space="preserve">. – </w:t>
+      </w:r>
+      <w:r>
+        <w:rPr>
+          <w:i w:val="1"/>
+          <w:iCs w:val="1"/>
+          <w:rtl w:val="0"/>
+        </w:rPr>
         <w:t xml:space="preserve">Week 15</w:t>
+      </w:r>
+    </w:p>
+    <w:p>
+      <w:pPr>
+        <w:spacing w:after="240" w:before="240" w:lineRule="auto"/>
+        <w:rPr/>
+      </w:pPr>
+      <w:r>
+        <w:rPr>
+          <w:b w:val="1"/>
+          <w:bCs w:val="1"/>
+          <w:rtl w:val="0"/>
+        </w:rPr>
+        <w:t xml:space="preserve">Milestones:</w:t>
+      </w:r>
+    </w:p>
+    <w:p>
+      <w:pPr>
+        <w:numPr>
+          <w:ilvl w:val="0"/>
+          <w:numId w:val="3"/>
+        </w:numPr>
+        <w:spacing w:after="0" w:afterAutospacing="0" w:before="240" w:beforeAutospacing="0" w:lineRule="auto"/>
+        <w:ind w:left="720" w:hanging="360"/>
+      </w:pPr>
+      <w:r>
+        <w:rPr>
+          <w:rtl w:val="0"/>
+        </w:rPr>
+        <w:t xml:space="preserve">October 11 – Contract 0.4.2 and service skeleton.</w:t>
+      </w:r>
+    </w:p>
+    <w:p>
+      <w:pPr>
+        <w:numPr>
+          <w:ilvl w:val="0"/>
+          <w:numId w:val="3"/>
+        </w:numPr>
+        <w:spacing w:after="0" w:afterAutospacing="0" w:before="0" w:beforeAutospacing="0" w:lineRule="auto"/>
+        <w:ind w:left="720" w:hanging="360"/>
+      </w:pPr>
+      <w:r>
+        <w:rPr>
+          <w:rtl w:val="0"/>
+        </w:rPr>
+        <w:t xml:space="preserve">November 1 – End-to-end pipeline with failure path.</w:t>
+      </w:r>
+    </w:p>
+    <w:p>
+      <w:pPr>
+        <w:numPr>
+          <w:ilvl w:val="0"/>
+          <w:numId w:val="3"/>
+        </w:numPr>
+        <w:spacing w:after="0" w:afterAutospacing="0" w:before="0" w:beforeAutospacing="0" w:lineRule="auto"/>
+        <w:ind w:left="720" w:hanging="360"/>
+      </w:pPr>
+      <w:r>
+        <w:rPr>
+          <w:rtl w:val="0"/>
+        </w:rPr>
+        <w:t xml:space="preserve">November 8 – Dashboard and load-test results.</w:t>
+      </w:r>
+    </w:p>
+    <w:p>
+      <w:pPr>
+        <w:numPr>
+          <w:ilvl w:val="0"/>
+          <w:numId w:val="3"/>
+        </w:numPr>
+        <w:spacing w:after="0" w:afterAutospacing="0" w:before="0" w:beforeAutospacing="0" w:lineRule="auto"/>
+        <w:ind w:left="720" w:hanging="360"/>
+      </w:pPr>
+      <w:r>
+        <w:rPr>
+          <w:rtl w:val="0"/>
+        </w:rPr>
+        <w:t xml:space="preserve">November 15 – VG08 integration; contract freeze.</w:t>
+      </w:r>
+    </w:p>
+    <w:p>
+      <w:pPr>
+        <w:numPr>
+          <w:ilvl w:val="0"/>
+          <w:numId w:val="3"/>
+        </w:numPr>
+        <w:spacing w:after="0" w:afterAutospacing="0" w:before="0" w:beforeAutospacing="0" w:lineRule="auto"/>
+        <w:ind w:left="720" w:hanging="360"/>
+      </w:pPr>
+      <w:r>
+        <w:rPr>
+          <w:rtl w:val="0"/>
+        </w:rPr>
+        <w:t xml:space="preserve">November 22 – Code freeze (soft freeze November 18).</w:t>
+      </w:r>
+    </w:p>
+    <w:p>
+      <w:pPr>
+        <w:numPr>
+          <w:ilvl w:val="0"/>
+          <w:numId w:val="3"/>
+        </w:numPr>
+        <w:spacing w:after="240" w:afterAutospacing="0" w:before="0" w:beforeAutospacing="0" w:lineRule="auto"/>
+        <w:ind w:left="720" w:hanging="360"/>
+      </w:pPr>
+      <w:r>
+        <w:rPr>
+          <w:rtl w:val="0"/>
+        </w:rPr>
+        <w:t xml:space="preserve">November 30 – Final presentation.</w:t>
       </w:r>
     </w:p>
     <w:p>

</xml_diff>